<commit_message>
Nombres y genero, actos del IFREM, conyuge en el Word, paginacion, OCR preciso, sesion de 15 minutos, lecturas en paralelo y plantilla CDMX mutuo soltero corregida
</commit_message>
<xml_diff>
--- a/backend/templates/CDMX_MUTUO_H_SOLTERO.docx
+++ b/backend/templates/CDMX_MUTUO_H_SOLTERO.docx
@@ -1925,25 +1925,22 @@
           <w:szCs w:val="14"/>
           <w:lang w:val="es-ES"/>
         </w:rPr>
-        <w:t>,</w:t>
-      </w:r>
-      <w:r>
-        <w:rPr>
-          <w:rFonts w:ascii="Arial" w:eastAsia="Batang" w:hAnsi="Arial" w:cs="Arial"/>
-          <w:bCs/>
-          <w:sz w:val="14"/>
-          <w:szCs w:val="14"/>
-        </w:rPr>
-        <w:t xml:space="preserve"> </w:t>
-      </w:r>
-      <w:r>
-        <w:rPr>
-          <w:rFonts w:ascii="Arial" w:eastAsia="Batang" w:hAnsi="Arial" w:cs="Arial"/>
-          <w:bCs/>
-          <w:sz w:val="14"/>
-          <w:szCs w:val="14"/>
-        </w:rPr>
-        <w:t xml:space="preserve">con el consentimiento de su cónyuge la señora </w:t>
+      </w:r>
+      <w:r>
+        <w:rPr>
+          <w:rFonts w:ascii="Arial" w:eastAsia="Batang" w:hAnsi="Arial" w:cs="Arial"/>
+          <w:bCs/>
+          <w:sz w:val="14"/>
+          <w:szCs w:val="14"/>
+        </w:rPr>
+      </w:r>
+      <w:r>
+        <w:rPr>
+          <w:rFonts w:ascii="Arial" w:eastAsia="Batang" w:hAnsi="Arial" w:cs="Arial"/>
+          <w:bCs/>
+          <w:sz w:val="14"/>
+          <w:szCs w:val="14"/>
+        </w:rPr>
       </w:r>
       <w:r>
         <w:rPr>
@@ -1953,7 +1950,6 @@
           <w:szCs w:val="14"/>
           <w:highlight w:val="yellow"/>
         </w:rPr>
-        <w:t>Patricia Nava Bautista</w:t>
       </w:r>
       <w:r>
         <w:rPr>
@@ -3328,24 +3324,21 @@
           <w:sz w:val="14"/>
           <w:szCs w:val="14"/>
         </w:rPr>
-        <w:t>,</w:t>
-      </w:r>
-      <w:r>
-        <w:rPr>
-          <w:rFonts w:ascii="Arial" w:eastAsia="Batang" w:hAnsi="Arial" w:cs="Arial"/>
-          <w:sz w:val="14"/>
-          <w:szCs w:val="14"/>
-        </w:rPr>
-        <w:t xml:space="preserve"> </w:t>
-      </w:r>
-      <w:r>
-        <w:rPr>
-          <w:rFonts w:ascii="Arial" w:eastAsia="Batang" w:hAnsi="Arial" w:cs="Arial"/>
-          <w:bCs/>
-          <w:sz w:val="14"/>
-          <w:szCs w:val="14"/>
-        </w:rPr>
-        <w:t>con el consentimiento de su cónyuge</w:t>
+      </w:r>
+      <w:r>
+        <w:rPr>
+          <w:rFonts w:ascii="Arial" w:eastAsia="Batang" w:hAnsi="Arial" w:cs="Arial"/>
+          <w:sz w:val="14"/>
+          <w:szCs w:val="14"/>
+        </w:rPr>
+      </w:r>
+      <w:r>
+        <w:rPr>
+          <w:rFonts w:ascii="Arial" w:eastAsia="Batang" w:hAnsi="Arial" w:cs="Arial"/>
+          <w:bCs/>
+          <w:sz w:val="14"/>
+          <w:szCs w:val="14"/>
+        </w:rPr>
       </w:r>
       <w:r>
         <w:rPr>

</xml_diff>